<commit_message>
update: format tabel State of the Art 8 kolom lengkap pada naskah docx dan markdown
</commit_message>
<xml_diff>
--- a/01_Naskah_Proposal_Master/OUTLINE_PROPOSAL_REVISI_FINAL.docx
+++ b/01_Naskah_Proposal_Master/OUTLINE_PROPOSAL_REVISI_FINAL.docx
@@ -640,44 +640,44 @@
         <w:tblLook w:firstColumn="1" w:firstRow="1" w:lastColumn="0" w:lastRow="0" w:noHBand="0" w:noVBand="1" w:val="04A0"/>
         <w:tblBorders>
           <w:top w:val="single" w:sz="4" w:space="0" w:color="CCCCCC"/>
-          <w:left w:val="single" w:sz="4" w:space="0" w:color="CCCCCC"/>
           <w:bottom w:val="single" w:sz="4" w:space="0" w:color="CCCCCC"/>
-          <w:right w:val="single" w:sz="4" w:space="0" w:color="CCCCCC"/>
-          <w:insideH w:val="single" w:sz="4" w:space="0" w:color="E0E0E0"/>
-          <w:insideV w:val="single" w:sz="4" w:space="0" w:color="E0E0E0"/>
+          <w:insideH w:val="single" w:sz="4" w:space="0" w:color="CCCCCC"/>
+          <w:left w:val="none"/>
+          <w:right w:val="none"/>
+          <w:insideV w:val="none"/>
         </w:tblBorders>
       </w:tblPr>
       <w:tblGrid>
-        <w:gridCol w:w="1560"/>
-        <w:gridCol w:w="1560"/>
-        <w:gridCol w:w="1560"/>
-        <w:gridCol w:w="1560"/>
-        <w:gridCol w:w="1560"/>
-        <w:gridCol w:w="1560"/>
+        <w:gridCol w:w="1040"/>
+        <w:gridCol w:w="1040"/>
+        <w:gridCol w:w="1040"/>
+        <w:gridCol w:w="1040"/>
+        <w:gridCol w:w="1040"/>
+        <w:gridCol w:w="1040"/>
+        <w:gridCol w:w="1040"/>
+        <w:gridCol w:w="1040"/>
+        <w:gridCol w:w="1040"/>
       </w:tblGrid>
       <w:tr>
         <w:tc>
           <w:tcPr>
-            <w:tcW w:type="dxa" w:w="1560"/>
-            <w:tcMar>
-              <w:top w:w="140" w:type="dxa"/>
-              <w:bottom w:w="140" w:type="dxa"/>
-              <w:left w:w="120" w:type="dxa"/>
-              <w:right w:w="120" w:type="dxa"/>
-            </w:tcMar>
-            <w:shd w:fill="1F4E79"/>
-            <w:shd w:fill="1E293B"/>
+            <w:tcW w:type="dxa" w:w="1040"/>
+            <w:shd w:val="clear" w:color="auto" w:fill="F2F4F7"/>
+            <w:vAlign w:val="top"/>
           </w:tcPr>
           <w:p>
             <w:pPr>
-              <w:spacing w:line="276" w:lineRule="auto" w:after="40" w:before="40"/>
+              <w:spacing w:before="40" w:after="40" w:line="252" w:lineRule="auto"/>
+              <w:jc w:val="center"/>
             </w:pPr>
+            <w:r/>
             <w:r>
               <w:rPr>
                 <w:rFonts w:ascii="Times New Roman" w:hAnsi="Times New Roman"/>
                 <w:b/>
-                <w:color w:val="FFFFFF"/>
-                <w:sz w:val="19"/>
+                <w:i w:val="0"/>
+                <w:color w:val="000000"/>
+                <w:sz w:val="18"/>
               </w:rPr>
               <w:t>No</w:t>
             </w:r>
@@ -685,136 +685,193 @@
         </w:tc>
         <w:tc>
           <w:tcPr>
-            <w:tcW w:type="dxa" w:w="1560"/>
-            <w:tcMar>
-              <w:top w:w="140" w:type="dxa"/>
-              <w:bottom w:w="140" w:type="dxa"/>
-              <w:left w:w="120" w:type="dxa"/>
-              <w:right w:w="120" w:type="dxa"/>
-            </w:tcMar>
-            <w:shd w:fill="1F4E79"/>
-            <w:shd w:fill="1E293B"/>
+            <w:tcW w:type="dxa" w:w="1040"/>
+            <w:shd w:val="clear" w:color="auto" w:fill="F2F4F7"/>
+            <w:vAlign w:val="top"/>
           </w:tcPr>
           <w:p>
             <w:pPr>
-              <w:spacing w:line="276" w:lineRule="auto" w:after="40" w:before="40"/>
+              <w:spacing w:before="40" w:after="40" w:line="252" w:lineRule="auto"/>
+              <w:jc w:val="center"/>
             </w:pPr>
+            <w:r/>
             <w:r>
               <w:rPr>
                 <w:rFonts w:ascii="Times New Roman" w:hAnsi="Times New Roman"/>
                 <w:b/>
-                <w:color w:val="FFFFFF"/>
-                <w:sz w:val="19"/>
+                <w:i w:val="0"/>
+                <w:color w:val="000000"/>
+                <w:sz w:val="18"/>
               </w:rPr>
-              <w:t>Peneliti, Tahun &amp; Reputasi Jurnal</w:t>
+              <w:t>Peneliti (Tahun)</w:t>
             </w:r>
           </w:p>
         </w:tc>
         <w:tc>
           <w:tcPr>
-            <w:tcW w:type="dxa" w:w="1560"/>
-            <w:tcMar>
-              <w:top w:w="140" w:type="dxa"/>
-              <w:bottom w:w="140" w:type="dxa"/>
-              <w:left w:w="120" w:type="dxa"/>
-              <w:right w:w="120" w:type="dxa"/>
-            </w:tcMar>
-            <w:shd w:fill="1F4E79"/>
-            <w:shd w:fill="1E293B"/>
+            <w:tcW w:type="dxa" w:w="1040"/>
+            <w:shd w:val="clear" w:color="auto" w:fill="F2F4F7"/>
+            <w:vAlign w:val="top"/>
           </w:tcPr>
           <w:p>
             <w:pPr>
-              <w:spacing w:line="276" w:lineRule="auto" w:after="40" w:before="40"/>
+              <w:spacing w:before="40" w:after="40" w:line="252" w:lineRule="auto"/>
+              <w:jc w:val="center"/>
             </w:pPr>
+            <w:r/>
             <w:r>
               <w:rPr>
                 <w:rFonts w:ascii="Times New Roman" w:hAnsi="Times New Roman"/>
                 <w:b/>
-                <w:color w:val="FFFFFF"/>
-                <w:sz w:val="19"/>
+                <w:i w:val="0"/>
+                <w:color w:val="000000"/>
+                <w:sz w:val="18"/>
               </w:rPr>
-              <w:t>Metode &amp; Hasil Utama</w:t>
+              <w:t>Judul Artikel</w:t>
             </w:r>
           </w:p>
         </w:tc>
         <w:tc>
           <w:tcPr>
-            <w:tcW w:type="dxa" w:w="1560"/>
-            <w:tcMar>
-              <w:top w:w="140" w:type="dxa"/>
-              <w:bottom w:w="140" w:type="dxa"/>
-              <w:left w:w="120" w:type="dxa"/>
-              <w:right w:w="120" w:type="dxa"/>
-            </w:tcMar>
-            <w:shd w:fill="1F4E79"/>
-            <w:shd w:fill="1E293B"/>
+            <w:tcW w:type="dxa" w:w="1040"/>
+            <w:shd w:val="clear" w:color="auto" w:fill="F2F4F7"/>
+            <w:vAlign w:val="top"/>
           </w:tcPr>
           <w:p>
             <w:pPr>
-              <w:spacing w:line="276" w:lineRule="auto" w:after="40" w:before="40"/>
+              <w:spacing w:before="40" w:after="40" w:line="252" w:lineRule="auto"/>
+              <w:jc w:val="center"/>
             </w:pPr>
+            <w:r/>
             <w:r>
               <w:rPr>
                 <w:rFonts w:ascii="Times New Roman" w:hAnsi="Times New Roman"/>
                 <w:b/>
-                <w:color w:val="FFFFFF"/>
-                <w:sz w:val="19"/>
+                <w:i w:val="0"/>
+                <w:color w:val="000000"/>
+                <w:sz w:val="18"/>
               </w:rPr>
-              <w:t>Temuan Gap / Kekurangan Jurnal</w:t>
+              <w:t>Dataset yang Digunakan</w:t>
             </w:r>
           </w:p>
         </w:tc>
         <w:tc>
           <w:tcPr>
-            <w:tcW w:type="dxa" w:w="1560"/>
-            <w:tcMar>
-              <w:top w:w="140" w:type="dxa"/>
-              <w:bottom w:w="140" w:type="dxa"/>
-              <w:left w:w="120" w:type="dxa"/>
-              <w:right w:w="120" w:type="dxa"/>
-            </w:tcMar>
-            <w:shd w:fill="1F4E79"/>
-            <w:shd w:fill="1E293B"/>
+            <w:tcW w:type="dxa" w:w="1040"/>
+            <w:shd w:val="clear" w:color="auto" w:fill="F2F4F7"/>
+            <w:vAlign w:val="top"/>
           </w:tcPr>
           <w:p>
             <w:pPr>
-              <w:spacing w:line="276" w:lineRule="auto" w:after="40" w:before="40"/>
+              <w:spacing w:before="40" w:after="40" w:line="252" w:lineRule="auto"/>
+              <w:jc w:val="center"/>
             </w:pPr>
+            <w:r/>
             <w:r>
               <w:rPr>
                 <w:rFonts w:ascii="Times New Roman" w:hAnsi="Times New Roman"/>
                 <w:b/>
-                <w:color w:val="FFFFFF"/>
-                <w:sz w:val="19"/>
+                <w:i w:val="0"/>
+                <w:color w:val="000000"/>
+                <w:sz w:val="18"/>
               </w:rPr>
-              <w:t>Apa yang Diperbaiki Penelitian Ini</w:t>
+              <w:t>Algoritma dan Metode</w:t>
             </w:r>
           </w:p>
         </w:tc>
         <w:tc>
           <w:tcPr>
-            <w:tcW w:type="dxa" w:w="1560"/>
-            <w:tcMar>
-              <w:top w:w="140" w:type="dxa"/>
-              <w:bottom w:w="140" w:type="dxa"/>
-              <w:left w:w="120" w:type="dxa"/>
-              <w:right w:w="120" w:type="dxa"/>
-            </w:tcMar>
-            <w:shd w:fill="1F4E79"/>
-            <w:shd w:fill="1E293B"/>
+            <w:tcW w:type="dxa" w:w="1040"/>
+            <w:shd w:val="clear" w:color="auto" w:fill="F2F4F7"/>
+            <w:vAlign w:val="top"/>
           </w:tcPr>
           <w:p>
             <w:pPr>
-              <w:spacing w:line="276" w:lineRule="auto" w:after="40" w:before="40"/>
+              <w:spacing w:before="40" w:after="40" w:line="252" w:lineRule="auto"/>
+              <w:jc w:val="center"/>
             </w:pPr>
+            <w:r/>
             <w:r>
               <w:rPr>
                 <w:rFonts w:ascii="Times New Roman" w:hAnsi="Times New Roman"/>
                 <w:b/>
-                <w:color w:val="FFFFFF"/>
-                <w:sz w:val="19"/>
+                <w:i w:val="0"/>
+                <w:color w:val="000000"/>
+                <w:sz w:val="18"/>
               </w:rPr>
-              <w:t>Penelitian Ini Lebih Baik Karena...</w:t>
+              <w:t>Metrik</w:t>
+            </w:r>
+          </w:p>
+        </w:tc>
+        <w:tc>
+          <w:tcPr>
+            <w:tcW w:type="dxa" w:w="1040"/>
+            <w:shd w:val="clear" w:color="auto" w:fill="F2F4F7"/>
+            <w:vAlign w:val="top"/>
+          </w:tcPr>
+          <w:p>
+            <w:pPr>
+              <w:spacing w:before="40" w:after="40" w:line="252" w:lineRule="auto"/>
+              <w:jc w:val="center"/>
+            </w:pPr>
+            <w:r/>
+            <w:r>
+              <w:rPr>
+                <w:rFonts w:ascii="Times New Roman" w:hAnsi="Times New Roman"/>
+                <w:b/>
+                <w:i w:val="0"/>
+                <w:color w:val="000000"/>
+                <w:sz w:val="18"/>
+              </w:rPr>
+              <w:t>Hasil</w:t>
+            </w:r>
+          </w:p>
+        </w:tc>
+        <w:tc>
+          <w:tcPr>
+            <w:tcW w:type="dxa" w:w="1040"/>
+            <w:shd w:val="clear" w:color="auto" w:fill="F2F4F7"/>
+            <w:vAlign w:val="top"/>
+          </w:tcPr>
+          <w:p>
+            <w:pPr>
+              <w:spacing w:before="40" w:after="40" w:line="252" w:lineRule="auto"/>
+              <w:jc w:val="center"/>
+            </w:pPr>
+            <w:r/>
+            <w:r>
+              <w:rPr>
+                <w:rFonts w:ascii="Times New Roman" w:hAnsi="Times New Roman"/>
+                <w:b/>
+                <w:i w:val="0"/>
+                <w:color w:val="000000"/>
+                <w:sz w:val="18"/>
+              </w:rPr>
+              <w:t>Celah (Research Gap)</w:t>
+            </w:r>
+          </w:p>
+        </w:tc>
+        <w:tc>
+          <w:tcPr>
+            <w:tcW w:type="dxa" w:w="1040"/>
+            <w:shd w:val="clear" w:color="auto" w:fill="F2F4F7"/>
+            <w:vAlign w:val="top"/>
+          </w:tcPr>
+          <w:p>
+            <w:pPr>
+              <w:spacing w:before="40" w:after="40" w:line="252" w:lineRule="auto"/>
+              <w:jc w:val="center"/>
+            </w:pPr>
+            <w:r/>
+            <w:r>
+              <w:rPr>
+                <w:rFonts w:ascii="Times New Roman" w:hAnsi="Times New Roman"/>
+                <w:b/>
+                <w:i w:val="0"/>
+                <w:color w:val="000000"/>
+                <w:sz w:val="18"/>
+              </w:rPr>
+              <w:t>Masalah yang Diselesaikan oleh Skripsi Ini</w:t>
             </w:r>
           </w:p>
         </w:tc>
@@ -822,26 +879,22 @@
       <w:tr>
         <w:tc>
           <w:tcPr>
-            <w:tcW w:type="dxa" w:w="1560"/>
-            <w:tcMar>
-              <w:top w:w="100" w:type="dxa"/>
-              <w:bottom w:w="100" w:type="dxa"/>
-              <w:left w:w="120" w:type="dxa"/>
-              <w:right w:w="120" w:type="dxa"/>
-            </w:tcMar>
-            <w:shd w:fill="F9FBFD"/>
-            <w:shd w:fill="F8FAFC"/>
+            <w:tcW w:type="dxa" w:w="1040"/>
+            <w:vAlign w:val="top"/>
           </w:tcPr>
           <w:p>
             <w:pPr>
-              <w:spacing w:line="276" w:lineRule="auto" w:after="40" w:before="40"/>
+              <w:spacing w:before="40" w:after="40" w:line="252" w:lineRule="auto"/>
               <w:jc w:val="center"/>
             </w:pPr>
+            <w:r/>
             <w:r>
               <w:rPr>
                 <w:rFonts w:ascii="Times New Roman" w:hAnsi="Times New Roman"/>
-                <w:b/>
-                <w:sz w:val="18"/>
+                <w:b w:val="0"/>
+                <w:i w:val="0"/>
+                <w:color w:val="000000"/>
+                <w:sz w:val="17"/>
               </w:rPr>
               <w:t>1</w:t>
             </w:r>
@@ -849,133 +902,185 @@
         </w:tc>
         <w:tc>
           <w:tcPr>
-            <w:tcW w:type="dxa" w:w="1560"/>
-            <w:tcMar>
-              <w:top w:w="100" w:type="dxa"/>
-              <w:bottom w:w="100" w:type="dxa"/>
-              <w:left w:w="120" w:type="dxa"/>
-              <w:right w:w="120" w:type="dxa"/>
-            </w:tcMar>
-            <w:shd w:fill="F9FBFD"/>
-            <w:shd w:fill="F8FAFC"/>
+            <w:tcW w:type="dxa" w:w="1040"/>
+            <w:vAlign w:val="top"/>
           </w:tcPr>
           <w:p>
             <w:pPr>
-              <w:spacing w:line="276" w:lineRule="auto" w:after="40" w:before="40"/>
+              <w:spacing w:before="40" w:after="40" w:line="252" w:lineRule="auto"/>
+              <w:jc w:val="left"/>
             </w:pPr>
+            <w:r/>
             <w:r>
               <w:rPr>
                 <w:rFonts w:ascii="Times New Roman" w:hAnsi="Times New Roman"/>
                 <w:b/>
-                <w:sz w:val="18"/>
+                <w:i w:val="0"/>
+                <w:color w:val="000000"/>
+                <w:sz w:val="17"/>
               </w:rPr>
               <w:t>Taher &amp; Ayon (2024)</w:t>
-              <w:br/>
-              <w:t>[IEEE PEEIACON]</w:t>
             </w:r>
           </w:p>
         </w:tc>
         <w:tc>
           <w:tcPr>
-            <w:tcW w:type="dxa" w:w="1560"/>
-            <w:tcMar>
-              <w:top w:w="100" w:type="dxa"/>
-              <w:bottom w:w="100" w:type="dxa"/>
-              <w:left w:w="120" w:type="dxa"/>
-              <w:right w:w="120" w:type="dxa"/>
-            </w:tcMar>
-            <w:shd w:fill="F9FBFD"/>
-            <w:shd w:fill="F8FAFC"/>
+            <w:tcW w:type="dxa" w:w="1040"/>
+            <w:vAlign w:val="top"/>
           </w:tcPr>
           <w:p>
             <w:pPr>
-              <w:spacing w:line="276" w:lineRule="auto" w:after="40" w:before="40"/>
+              <w:spacing w:before="40" w:after="40" w:line="252" w:lineRule="auto"/>
+              <w:jc w:val="left"/>
             </w:pPr>
+            <w:r/>
             <w:r>
               <w:rPr>
                 <w:rFonts w:ascii="Times New Roman" w:hAnsi="Times New Roman"/>
-                <w:sz w:val="18"/>
+                <w:b w:val="0"/>
+                <w:i/>
+                <w:color w:val="000000"/>
+                <w:sz w:val="17"/>
               </w:rPr>
-              <w:t>Gradient Boosting, Random Forest, AdaBoost pada data gaya hidup tidur.</w:t>
-              <w:br/>
-              <w:br/>
-              <w:t>Hasil: Gradient Boosting meraih akurasi tertinggi 93,80%.</w:t>
+              <w:t>Exploring Sleep Disorders: A Comparative Analysis of Machine Learning Algorithms on Sleep Health and Lifestyle Data</w:t>
             </w:r>
           </w:p>
         </w:tc>
         <w:tc>
           <w:tcPr>
-            <w:tcW w:type="dxa" w:w="1560"/>
-            <w:tcMar>
-              <w:top w:w="100" w:type="dxa"/>
-              <w:bottom w:w="100" w:type="dxa"/>
-              <w:left w:w="120" w:type="dxa"/>
-              <w:right w:w="120" w:type="dxa"/>
-            </w:tcMar>
-            <w:shd w:fill="F9FBFD"/>
-            <w:shd w:fill="F8FAFC"/>
+            <w:tcW w:type="dxa" w:w="1040"/>
+            <w:vAlign w:val="top"/>
           </w:tcPr>
           <w:p>
             <w:pPr>
-              <w:spacing w:line="276" w:lineRule="auto" w:after="40" w:before="40"/>
+              <w:spacing w:before="40" w:after="40" w:line="252" w:lineRule="auto"/>
+              <w:jc w:val="left"/>
             </w:pPr>
+            <w:r/>
             <w:r>
               <w:rPr>
                 <w:rFonts w:ascii="Times New Roman" w:hAnsi="Times New Roman"/>
-                <w:sz w:val="18"/>
+                <w:b w:val="0"/>
+                <w:i w:val="0"/>
+                <w:color w:val="000000"/>
+                <w:sz w:val="17"/>
               </w:rPr>
-              <w:t>Model beroperasi murni sebagai kotak hitam (black-box) tanpa penjelasan (XAI); hanya mengeluarkan skor risiko tanpa mampu menjelaskan faktor pemicu spesifik pasien (lack of actionable insight).</w:t>
+              <w:t>Sleep Health and Lifestyle Dataset (374 instans, 13 fitur demografi dan gaya hidup)</w:t>
             </w:r>
           </w:p>
         </w:tc>
         <w:tc>
           <w:tcPr>
-            <w:tcW w:type="dxa" w:w="1560"/>
-            <w:tcMar>
-              <w:top w:w="100" w:type="dxa"/>
-              <w:bottom w:w="100" w:type="dxa"/>
-              <w:left w:w="120" w:type="dxa"/>
-              <w:right w:w="120" w:type="dxa"/>
-            </w:tcMar>
-            <w:shd w:fill="F9FBFD"/>
-            <w:shd w:fill="F8FAFC"/>
+            <w:tcW w:type="dxa" w:w="1040"/>
+            <w:vAlign w:val="top"/>
           </w:tcPr>
           <w:p>
             <w:pPr>
-              <w:spacing w:line="276" w:lineRule="auto" w:after="40" w:before="40"/>
+              <w:spacing w:before="40" w:after="40" w:line="252" w:lineRule="auto"/>
+              <w:jc w:val="left"/>
             </w:pPr>
+            <w:r/>
             <w:r>
               <w:rPr>
                 <w:rFonts w:ascii="Times New Roman" w:hAnsi="Times New Roman"/>
-                <w:sz w:val="18"/>
+                <w:b w:val="0"/>
+                <w:i w:val="0"/>
+                <w:color w:val="000000"/>
+                <w:sz w:val="17"/>
               </w:rPr>
-              <w:t>Mengintegrasikan metode Explainable AI (Tree-SHAP) untuk membuka kotak hitam model dan menghitung nilai kontribusi marginal setiap fitur gaya hidup secara transparan.</w:t>
+              <w:t>Random Forest, AdaBoost, Logistic Regression, Gradient Boosting Machine (GBM)</w:t>
             </w:r>
           </w:p>
         </w:tc>
         <w:tc>
           <w:tcPr>
-            <w:tcW w:type="dxa" w:w="1560"/>
-            <w:tcMar>
-              <w:top w:w="100" w:type="dxa"/>
-              <w:bottom w:w="100" w:type="dxa"/>
-              <w:left w:w="120" w:type="dxa"/>
-              <w:right w:w="120" w:type="dxa"/>
-            </w:tcMar>
-            <w:shd w:fill="F9FBFD"/>
-            <w:shd w:fill="F8FAFC"/>
+            <w:tcW w:type="dxa" w:w="1040"/>
+            <w:vAlign w:val="top"/>
           </w:tcPr>
           <w:p>
             <w:pPr>
-              <w:spacing w:line="276" w:lineRule="auto" w:after="40" w:before="40"/>
+              <w:spacing w:before="40" w:after="40" w:line="252" w:lineRule="auto"/>
+              <w:jc w:val="left"/>
             </w:pPr>
+            <w:r/>
             <w:r>
               <w:rPr>
                 <w:rFonts w:ascii="Times New Roman" w:hAnsi="Times New Roman"/>
-                <w:b/>
-                <w:sz w:val="18"/>
+                <w:b w:val="0"/>
+                <w:i w:val="0"/>
+                <w:color w:val="000000"/>
+                <w:sz w:val="17"/>
               </w:rPr>
-              <w:t>Penelitian ini lebih baik karena tidak hanya menebak tingkat risiko secara akurat, melainkan menyajikan penjelasan transparan 'mengapa' risiko tersebut muncul dan kebiasaan spesifik apa yang memicunya.</w:t>
+              <w:t>Akurasi, Precision, Recall, F1-Score</w:t>
+            </w:r>
+          </w:p>
+        </w:tc>
+        <w:tc>
+          <w:tcPr>
+            <w:tcW w:type="dxa" w:w="1040"/>
+            <w:vAlign w:val="top"/>
+          </w:tcPr>
+          <w:p>
+            <w:pPr>
+              <w:spacing w:before="40" w:after="40" w:line="252" w:lineRule="auto"/>
+              <w:jc w:val="left"/>
+            </w:pPr>
+            <w:r/>
+            <w:r>
+              <w:rPr>
+                <w:rFonts w:ascii="Times New Roman" w:hAnsi="Times New Roman"/>
+                <w:b w:val="0"/>
+                <w:i w:val="0"/>
+                <w:color w:val="000000"/>
+                <w:sz w:val="17"/>
+              </w:rPr>
+              <w:t>Gradient Boosting mencapai performa tertinggi: Akurasi 93,80%, Precision 94,10%, Recall 93,80%, dan F1-Score 93,90%.</w:t>
+            </w:r>
+          </w:p>
+        </w:tc>
+        <w:tc>
+          <w:tcPr>
+            <w:tcW w:type="dxa" w:w="1040"/>
+            <w:vAlign w:val="top"/>
+          </w:tcPr>
+          <w:p>
+            <w:pPr>
+              <w:spacing w:before="40" w:after="40" w:line="252" w:lineRule="auto"/>
+              <w:jc w:val="left"/>
+            </w:pPr>
+            <w:r/>
+            <w:r>
+              <w:rPr>
+                <w:rFonts w:ascii="Times New Roman" w:hAnsi="Times New Roman"/>
+                <w:b w:val="0"/>
+                <w:i w:val="0"/>
+                <w:color w:val="000000"/>
+                <w:sz w:val="17"/>
+              </w:rPr>
+              <w:t>Model murni beroperasi sebagai black-box tanpa penjelasan kontribusi fitur individual, serta variabel kategorikal diubah via label encoding manual yang memicu bias ordinal buatan.</w:t>
+            </w:r>
+          </w:p>
+        </w:tc>
+        <w:tc>
+          <w:tcPr>
+            <w:tcW w:type="dxa" w:w="1040"/>
+            <w:vAlign w:val="top"/>
+          </w:tcPr>
+          <w:p>
+            <w:pPr>
+              <w:spacing w:before="40" w:after="40" w:line="252" w:lineRule="auto"/>
+              <w:jc w:val="left"/>
+            </w:pPr>
+            <w:r/>
+            <w:r>
+              <w:rPr>
+                <w:rFonts w:ascii="Times New Roman" w:hAnsi="Times New Roman"/>
+                <w:b w:val="0"/>
+                <w:i w:val="0"/>
+                <w:color w:val="000000"/>
+                <w:sz w:val="17"/>
+              </w:rPr>
+              <w:t>Menerapkan algoritma CatBoost yang memproses fitur kategorikal secara native dan mengintegrasikan Tree-SHAP untuk membedah transparansi penyebab risiko secara personal per individu.</w:t>
             </w:r>
           </w:p>
         </w:tc>
@@ -983,26 +1088,22 @@
       <w:tr>
         <w:tc>
           <w:tcPr>
-            <w:tcW w:type="dxa" w:w="1560"/>
-            <w:tcMar>
-              <w:top w:w="100" w:type="dxa"/>
-              <w:bottom w:w="100" w:type="dxa"/>
-              <w:left w:w="120" w:type="dxa"/>
-              <w:right w:w="120" w:type="dxa"/>
-            </w:tcMar>
-            <w:shd w:fill="FFFFFF"/>
-            <w:shd w:fill="FFFFFF"/>
+            <w:tcW w:type="dxa" w:w="1040"/>
+            <w:vAlign w:val="top"/>
           </w:tcPr>
           <w:p>
             <w:pPr>
-              <w:spacing w:line="276" w:lineRule="auto" w:after="40" w:before="40"/>
+              <w:spacing w:before="40" w:after="40" w:line="252" w:lineRule="auto"/>
               <w:jc w:val="center"/>
             </w:pPr>
+            <w:r/>
             <w:r>
               <w:rPr>
                 <w:rFonts w:ascii="Times New Roman" w:hAnsi="Times New Roman"/>
-                <w:b/>
-                <w:sz w:val="18"/>
+                <w:b w:val="0"/>
+                <w:i w:val="0"/>
+                <w:color w:val="000000"/>
+                <w:sz w:val="17"/>
               </w:rPr>
               <w:t>2</w:t>
             </w:r>
@@ -1010,133 +1111,185 @@
         </w:tc>
         <w:tc>
           <w:tcPr>
-            <w:tcW w:type="dxa" w:w="1560"/>
-            <w:tcMar>
-              <w:top w:w="100" w:type="dxa"/>
-              <w:bottom w:w="100" w:type="dxa"/>
-              <w:left w:w="120" w:type="dxa"/>
-              <w:right w:w="120" w:type="dxa"/>
-            </w:tcMar>
-            <w:shd w:fill="FFFFFF"/>
-            <w:shd w:fill="FFFFFF"/>
+            <w:tcW w:type="dxa" w:w="1040"/>
+            <w:vAlign w:val="top"/>
           </w:tcPr>
           <w:p>
             <w:pPr>
-              <w:spacing w:line="276" w:lineRule="auto" w:after="40" w:before="40"/>
+              <w:spacing w:before="40" w:after="40" w:line="252" w:lineRule="auto"/>
+              <w:jc w:val="left"/>
             </w:pPr>
+            <w:r/>
             <w:r>
               <w:rPr>
                 <w:rFonts w:ascii="Times New Roman" w:hAnsi="Times New Roman"/>
                 <w:b/>
-                <w:sz w:val="18"/>
+                <w:i w:val="0"/>
+                <w:color w:val="000000"/>
+                <w:sz w:val="17"/>
               </w:rPr>
               <w:t>Lin et al. (2025)</w:t>
-              <w:br/>
-              <w:t>[Frontiers in Psychiatry, Q1]</w:t>
             </w:r>
           </w:p>
         </w:tc>
         <w:tc>
           <w:tcPr>
-            <w:tcW w:type="dxa" w:w="1560"/>
-            <w:tcMar>
-              <w:top w:w="100" w:type="dxa"/>
-              <w:bottom w:w="100" w:type="dxa"/>
-              <w:left w:w="120" w:type="dxa"/>
-              <w:right w:w="120" w:type="dxa"/>
-            </w:tcMar>
-            <w:shd w:fill="FFFFFF"/>
-            <w:shd w:fill="FFFFFF"/>
+            <w:tcW w:type="dxa" w:w="1040"/>
+            <w:vAlign w:val="top"/>
           </w:tcPr>
           <w:p>
             <w:pPr>
-              <w:spacing w:line="276" w:lineRule="auto" w:after="40" w:before="40"/>
+              <w:spacing w:before="40" w:after="40" w:line="252" w:lineRule="auto"/>
+              <w:jc w:val="left"/>
             </w:pPr>
+            <w:r/>
             <w:r>
               <w:rPr>
                 <w:rFonts w:ascii="Times New Roman" w:hAnsi="Times New Roman"/>
-                <w:sz w:val="18"/>
+                <w:b w:val="0"/>
+                <w:i/>
+                <w:color w:val="000000"/>
+                <w:sz w:val="17"/>
               </w:rPr>
-              <w:t>ANN, Decision Tree, Naive Bayes pada 20.645 data survei mahasiswa.</w:t>
-              <w:br/>
-              <w:br/>
-              <w:t>Hasil: Berhasil memetakan korelasi durasi layar, kopi, dan begadang terhadap kualitas tidur.</w:t>
+              <w:t>Evaluation of Sleep Quality and Influencing Factors Among Medical and Non-Medical Students Using Machine Learning Techniques in Fujian During the Public Health Emergencies</w:t>
             </w:r>
           </w:p>
         </w:tc>
         <w:tc>
           <w:tcPr>
-            <w:tcW w:type="dxa" w:w="1560"/>
-            <w:tcMar>
-              <w:top w:w="100" w:type="dxa"/>
-              <w:bottom w:w="100" w:type="dxa"/>
-              <w:left w:w="120" w:type="dxa"/>
-              <w:right w:w="120" w:type="dxa"/>
-            </w:tcMar>
-            <w:shd w:fill="FFFFFF"/>
-            <w:shd w:fill="FFFFFF"/>
+            <w:tcW w:type="dxa" w:w="1040"/>
+            <w:vAlign w:val="top"/>
           </w:tcPr>
           <w:p>
             <w:pPr>
-              <w:spacing w:line="276" w:lineRule="auto" w:after="40" w:before="40"/>
+              <w:spacing w:before="40" w:after="40" w:line="252" w:lineRule="auto"/>
+              <w:jc w:val="left"/>
             </w:pPr>
+            <w:r/>
             <w:r>
               <w:rPr>
                 <w:rFonts w:ascii="Times New Roman" w:hAnsi="Times New Roman"/>
-                <w:sz w:val="18"/>
+                <w:b w:val="0"/>
+                <w:i w:val="0"/>
+                <w:color w:val="000000"/>
+                <w:sz w:val="17"/>
               </w:rPr>
-              <w:t>Analisis model hanya berlaku pada tataran agregat populasi umum (rata-rata kelompok); tidak mampu memberikan penjelasan risiko secara personal untuk masing-masing individu pasien.</w:t>
+              <w:t>Data survei kuesioner PSQI 20.645 mahasiswa di Fujian, Tiongkok</w:t>
             </w:r>
           </w:p>
         </w:tc>
         <w:tc>
           <w:tcPr>
-            <w:tcW w:type="dxa" w:w="1560"/>
-            <w:tcMar>
-              <w:top w:w="100" w:type="dxa"/>
-              <w:bottom w:w="100" w:type="dxa"/>
-              <w:left w:w="120" w:type="dxa"/>
-              <w:right w:w="120" w:type="dxa"/>
-            </w:tcMar>
-            <w:shd w:fill="FFFFFF"/>
-            <w:shd w:fill="FFFFFF"/>
+            <w:tcW w:type="dxa" w:w="1040"/>
+            <w:vAlign w:val="top"/>
           </w:tcPr>
           <w:p>
             <w:pPr>
-              <w:spacing w:line="276" w:lineRule="auto" w:after="40" w:before="40"/>
+              <w:spacing w:before="40" w:after="40" w:line="252" w:lineRule="auto"/>
+              <w:jc w:val="left"/>
             </w:pPr>
+            <w:r/>
             <w:r>
               <w:rPr>
                 <w:rFonts w:ascii="Times New Roman" w:hAnsi="Times New Roman"/>
-                <w:sz w:val="18"/>
+                <w:b w:val="0"/>
+                <w:i w:val="0"/>
+                <w:color w:val="000000"/>
+                <w:sz w:val="17"/>
               </w:rPr>
-              <w:t>Menerapkan analisis SHAP lokal (waterfall plot) yang membedah profil risiko unik tiap individu secara interaktif per sesi pemeriksaan.</w:t>
+              <w:t>Artificial Neural Network (ANN), Decision Tree, Gradient Boosting Trees, Naive Bayes</w:t>
             </w:r>
           </w:p>
         </w:tc>
         <w:tc>
           <w:tcPr>
-            <w:tcW w:type="dxa" w:w="1560"/>
-            <w:tcMar>
-              <w:top w:w="100" w:type="dxa"/>
-              <w:bottom w:w="100" w:type="dxa"/>
-              <w:left w:w="120" w:type="dxa"/>
-              <w:right w:w="120" w:type="dxa"/>
-            </w:tcMar>
-            <w:shd w:fill="FFFFFF"/>
-            <w:shd w:fill="FFFFFF"/>
+            <w:tcW w:type="dxa" w:w="1040"/>
+            <w:vAlign w:val="top"/>
           </w:tcPr>
           <w:p>
             <w:pPr>
-              <w:spacing w:line="276" w:lineRule="auto" w:after="40" w:before="40"/>
+              <w:spacing w:before="40" w:after="40" w:line="252" w:lineRule="auto"/>
+              <w:jc w:val="left"/>
             </w:pPr>
+            <w:r/>
             <w:r>
               <w:rPr>
                 <w:rFonts w:ascii="Times New Roman" w:hAnsi="Times New Roman"/>
-                <w:b/>
-                <w:sz w:val="18"/>
+                <w:b w:val="0"/>
+                <w:i w:val="0"/>
+                <w:color w:val="000000"/>
+                <w:sz w:val="17"/>
               </w:rPr>
-              <w:t>Penelitian ini lebih baik karena mendukung kedokteran personal (personalized healthcare); dua pasien dengan tingkat risiko sama dapat diketahui akar penyebab kebiasaan yang berbeda secara spesifik.</w:t>
+              <w:t>Akurasi, Sensitivity, Specificity, AUC-ROC</w:t>
+            </w:r>
+          </w:p>
+        </w:tc>
+        <w:tc>
+          <w:tcPr>
+            <w:tcW w:type="dxa" w:w="1040"/>
+            <w:vAlign w:val="top"/>
+          </w:tcPr>
+          <w:p>
+            <w:pPr>
+              <w:spacing w:before="40" w:after="40" w:line="252" w:lineRule="auto"/>
+              <w:jc w:val="left"/>
+            </w:pPr>
+            <w:r/>
+            <w:r>
+              <w:rPr>
+                <w:rFonts w:ascii="Times New Roman" w:hAnsi="Times New Roman"/>
+                <w:b w:val="0"/>
+                <w:i w:val="0"/>
+                <w:color w:val="000000"/>
+                <w:sz w:val="17"/>
+              </w:rPr>
+              <w:t>Model ensemble memetakan faktor risiko mahasiswa dengan Akurasi 86,40% dan AUC-ROC 0,891.</w:t>
+            </w:r>
+          </w:p>
+        </w:tc>
+        <w:tc>
+          <w:tcPr>
+            <w:tcW w:type="dxa" w:w="1040"/>
+            <w:vAlign w:val="top"/>
+          </w:tcPr>
+          <w:p>
+            <w:pPr>
+              <w:spacing w:before="40" w:after="40" w:line="252" w:lineRule="auto"/>
+              <w:jc w:val="left"/>
+            </w:pPr>
+            <w:r/>
+            <w:r>
+              <w:rPr>
+                <w:rFonts w:ascii="Times New Roman" w:hAnsi="Times New Roman"/>
+                <w:b w:val="0"/>
+                <w:i w:val="0"/>
+                <w:color w:val="000000"/>
+                <w:sz w:val="17"/>
+              </w:rPr>
+              <w:t>Analisis hanya berlaku di tingkat agregat populasi (makro); tidak mampu memberikan penjelasan personal di tingkat individu (local explanation) untuk interaksi non-linier kebiasaan digital.</w:t>
+            </w:r>
+          </w:p>
+        </w:tc>
+        <w:tc>
+          <w:tcPr>
+            <w:tcW w:type="dxa" w:w="1040"/>
+            <w:vAlign w:val="top"/>
+          </w:tcPr>
+          <w:p>
+            <w:pPr>
+              <w:spacing w:before="40" w:after="40" w:line="252" w:lineRule="auto"/>
+              <w:jc w:val="left"/>
+            </w:pPr>
+            <w:r/>
+            <w:r>
+              <w:rPr>
+                <w:rFonts w:ascii="Times New Roman" w:hAnsi="Times New Roman"/>
+                <w:b w:val="0"/>
+                <w:i w:val="0"/>
+                <w:color w:val="000000"/>
+                <w:sz w:val="17"/>
+              </w:rPr>
+              <w:t>Menganalisis interaksi non-linier fitur gaya hidup secara granular per individu menggunakan CatBoost dan visualisasi Tree-SHAP individual, bukan sekadar agregasi populasi.</w:t>
             </w:r>
           </w:p>
         </w:tc>
@@ -1144,26 +1297,22 @@
       <w:tr>
         <w:tc>
           <w:tcPr>
-            <w:tcW w:type="dxa" w:w="1560"/>
-            <w:tcMar>
-              <w:top w:w="100" w:type="dxa"/>
-              <w:bottom w:w="100" w:type="dxa"/>
-              <w:left w:w="120" w:type="dxa"/>
-              <w:right w:w="120" w:type="dxa"/>
-            </w:tcMar>
-            <w:shd w:fill="F9FBFD"/>
-            <w:shd w:fill="F8FAFC"/>
+            <w:tcW w:type="dxa" w:w="1040"/>
+            <w:vAlign w:val="top"/>
           </w:tcPr>
           <w:p>
             <w:pPr>
-              <w:spacing w:line="276" w:lineRule="auto" w:after="40" w:before="40"/>
+              <w:spacing w:before="40" w:after="40" w:line="252" w:lineRule="auto"/>
               <w:jc w:val="center"/>
             </w:pPr>
+            <w:r/>
             <w:r>
               <w:rPr>
                 <w:rFonts w:ascii="Times New Roman" w:hAnsi="Times New Roman"/>
-                <w:b/>
-                <w:sz w:val="18"/>
+                <w:b w:val="0"/>
+                <w:i w:val="0"/>
+                <w:color w:val="000000"/>
+                <w:sz w:val="17"/>
               </w:rPr>
               <w:t>3</w:t>
             </w:r>
@@ -1171,133 +1320,185 @@
         </w:tc>
         <w:tc>
           <w:tcPr>
-            <w:tcW w:type="dxa" w:w="1560"/>
-            <w:tcMar>
-              <w:top w:w="100" w:type="dxa"/>
-              <w:bottom w:w="100" w:type="dxa"/>
-              <w:left w:w="120" w:type="dxa"/>
-              <w:right w:w="120" w:type="dxa"/>
-            </w:tcMar>
-            <w:shd w:fill="F9FBFD"/>
-            <w:shd w:fill="F8FAFC"/>
+            <w:tcW w:type="dxa" w:w="1040"/>
+            <w:vAlign w:val="top"/>
           </w:tcPr>
           <w:p>
             <w:pPr>
-              <w:spacing w:line="276" w:lineRule="auto" w:after="40" w:before="40"/>
+              <w:spacing w:before="40" w:after="40" w:line="252" w:lineRule="auto"/>
+              <w:jc w:val="left"/>
             </w:pPr>
+            <w:r/>
             <w:r>
               <w:rPr>
                 <w:rFonts w:ascii="Times New Roman" w:hAnsi="Times New Roman"/>
                 <w:b/>
-                <w:sz w:val="18"/>
+                <w:i w:val="0"/>
+                <w:color w:val="000000"/>
+                <w:sz w:val="17"/>
               </w:rPr>
               <w:t>Ha et al. (2023)</w:t>
-              <w:br/>
-              <w:t>[Journal of Medical Internet Research, Q1]</w:t>
             </w:r>
           </w:p>
         </w:tc>
         <w:tc>
           <w:tcPr>
-            <w:tcW w:type="dxa" w:w="1560"/>
-            <w:tcMar>
-              <w:top w:w="100" w:type="dxa"/>
-              <w:bottom w:w="100" w:type="dxa"/>
-              <w:left w:w="120" w:type="dxa"/>
-              <w:right w:w="120" w:type="dxa"/>
-            </w:tcMar>
-            <w:shd w:fill="F9FBFD"/>
-            <w:shd w:fill="F8FAFC"/>
+            <w:tcW w:type="dxa" w:w="1040"/>
+            <w:vAlign w:val="top"/>
           </w:tcPr>
           <w:p>
             <w:pPr>
-              <w:spacing w:line="276" w:lineRule="auto" w:after="40" w:before="40"/>
+              <w:spacing w:before="40" w:after="40" w:line="252" w:lineRule="auto"/>
+              <w:jc w:val="left"/>
             </w:pPr>
+            <w:r/>
             <w:r>
               <w:rPr>
                 <w:rFonts w:ascii="Times New Roman" w:hAnsi="Times New Roman"/>
-                <w:sz w:val="18"/>
+                <w:b w:val="0"/>
+                <w:i/>
+                <w:color w:val="000000"/>
+                <w:sz w:val="17"/>
               </w:rPr>
-              <w:t>XGBoost + SHAP pada 4.622 kuesioner medis klinis rumah sakit.</w:t>
-              <w:br/>
-              <w:br/>
-              <w:t>Hasil: Mencapai AUROC &gt;0,897 untuk klasifikasi OSA dan insomnia.</w:t>
+              <w:t>Predicting the Risk of Sleep Disorders Using a Machine Learning–Based Simple Questionnaire: Development and Validation Study</w:t>
             </w:r>
           </w:p>
         </w:tc>
         <w:tc>
           <w:tcPr>
-            <w:tcW w:type="dxa" w:w="1560"/>
-            <w:tcMar>
-              <w:top w:w="100" w:type="dxa"/>
-              <w:bottom w:w="100" w:type="dxa"/>
-              <w:left w:w="120" w:type="dxa"/>
-              <w:right w:w="120" w:type="dxa"/>
-            </w:tcMar>
-            <w:shd w:fill="F9FBFD"/>
-            <w:shd w:fill="F8FAFC"/>
+            <w:tcW w:type="dxa" w:w="1040"/>
+            <w:vAlign w:val="top"/>
           </w:tcPr>
           <w:p>
             <w:pPr>
-              <w:spacing w:line="276" w:lineRule="auto" w:after="40" w:before="40"/>
+              <w:spacing w:before="40" w:after="40" w:line="252" w:lineRule="auto"/>
+              <w:jc w:val="left"/>
             </w:pPr>
+            <w:r/>
             <w:r>
               <w:rPr>
                 <w:rFonts w:ascii="Times New Roman" w:hAnsi="Times New Roman"/>
-                <w:sz w:val="18"/>
+                <w:b w:val="0"/>
+                <w:i w:val="0"/>
+                <w:color w:val="000000"/>
+                <w:sz w:val="17"/>
               </w:rPr>
-              <w:t>Fitur berbasis kuesioner medis statis di rumah sakit; metode SHAP hanya difungsikan sebatas seleksi fitur di awal, bukan untuk eksplanasi interaktif per pasien saat prediksi dijalankan.</w:t>
+              <w:t>Data klinis 4.622 pasien dari 2 rumah sakit (Samsung Medical Center &amp; Ewha Womans University Medical Center)</w:t>
             </w:r>
           </w:p>
         </w:tc>
         <w:tc>
           <w:tcPr>
-            <w:tcW w:type="dxa" w:w="1560"/>
-            <w:tcMar>
-              <w:top w:w="100" w:type="dxa"/>
-              <w:bottom w:w="100" w:type="dxa"/>
-              <w:left w:w="120" w:type="dxa"/>
-              <w:right w:w="120" w:type="dxa"/>
-            </w:tcMar>
-            <w:shd w:fill="F9FBFD"/>
-            <w:shd w:fill="F8FAFC"/>
+            <w:tcW w:type="dxa" w:w="1040"/>
+            <w:vAlign w:val="top"/>
           </w:tcPr>
           <w:p>
             <w:pPr>
-              <w:spacing w:line="276" w:lineRule="auto" w:after="40" w:before="40"/>
+              <w:spacing w:before="40" w:after="40" w:line="252" w:lineRule="auto"/>
+              <w:jc w:val="left"/>
             </w:pPr>
+            <w:r/>
             <w:r>
               <w:rPr>
                 <w:rFonts w:ascii="Times New Roman" w:hAnsi="Times New Roman"/>
-                <w:sz w:val="18"/>
+                <w:b w:val="0"/>
+                <w:i w:val="0"/>
+                <w:color w:val="000000"/>
+                <w:sz w:val="17"/>
               </w:rPr>
-              <w:t>Memanfaatkan 32 metrik gaya hidup digital harian yang bersifat modifiable (dapat diubah perilakunya), serta mengintegrasikan Tree-SHAP secara real-time saat inferensi.</w:t>
+              <w:t>Extreme Gradient Boosting (XGBoost) dengan seleksi fitur SHAP</w:t>
             </w:r>
           </w:p>
         </w:tc>
         <w:tc>
           <w:tcPr>
-            <w:tcW w:type="dxa" w:w="1560"/>
-            <w:tcMar>
-              <w:top w:w="100" w:type="dxa"/>
-              <w:bottom w:w="100" w:type="dxa"/>
-              <w:left w:w="120" w:type="dxa"/>
-              <w:right w:w="120" w:type="dxa"/>
-            </w:tcMar>
-            <w:shd w:fill="F9FBFD"/>
-            <w:shd w:fill="F8FAFC"/>
+            <w:tcW w:type="dxa" w:w="1040"/>
+            <w:vAlign w:val="top"/>
           </w:tcPr>
           <w:p>
             <w:pPr>
-              <w:spacing w:line="276" w:lineRule="auto" w:after="40" w:before="40"/>
+              <w:spacing w:before="40" w:after="40" w:line="252" w:lineRule="auto"/>
+              <w:jc w:val="left"/>
             </w:pPr>
+            <w:r/>
             <w:r>
               <w:rPr>
                 <w:rFonts w:ascii="Times New Roman" w:hAnsi="Times New Roman"/>
-                <w:b/>
-                <w:sz w:val="18"/>
+                <w:b w:val="0"/>
+                <w:i w:val="0"/>
+                <w:color w:val="000000"/>
+                <w:sz w:val="17"/>
               </w:rPr>
-              <w:t>Penelitian ini lebih baik karena eksplanasi XAI dihasilkan seketika saat pasien mengisi data, dan berfokus pada kebiasaan yang dapat langsung diubah pasien tanpa perlu uji lab klinis yang mahal.</w:t>
+              <w:t>AUROC, Sensitivity, Specificity, Brier Score</w:t>
+            </w:r>
+          </w:p>
+        </w:tc>
+        <w:tc>
+          <w:tcPr>
+            <w:tcW w:type="dxa" w:w="1040"/>
+            <w:vAlign w:val="top"/>
+          </w:tcPr>
+          <w:p>
+            <w:pPr>
+              <w:spacing w:before="40" w:after="40" w:line="252" w:lineRule="auto"/>
+              <w:jc w:val="left"/>
+            </w:pPr>
+            <w:r/>
+            <w:r>
+              <w:rPr>
+                <w:rFonts w:ascii="Times New Roman" w:hAnsi="Times New Roman"/>
+                <w:b w:val="0"/>
+                <w:i w:val="0"/>
+                <w:color w:val="000000"/>
+                <w:sz w:val="17"/>
+              </w:rPr>
+              <w:t>AUROC &gt; 0,897 untuk ketiga gangguan tidur (OSA, COMISA, insomnia); menghasilkan kuesioner ringkas SLEEPS 9 item.</w:t>
+            </w:r>
+          </w:p>
+        </w:tc>
+        <w:tc>
+          <w:tcPr>
+            <w:tcW w:type="dxa" w:w="1040"/>
+            <w:vAlign w:val="top"/>
+          </w:tcPr>
+          <w:p>
+            <w:pPr>
+              <w:spacing w:before="40" w:after="40" w:line="252" w:lineRule="auto"/>
+              <w:jc w:val="left"/>
+            </w:pPr>
+            <w:r/>
+            <w:r>
+              <w:rPr>
+                <w:rFonts w:ascii="Times New Roman" w:hAnsi="Times New Roman"/>
+                <w:b w:val="0"/>
+                <w:i w:val="0"/>
+                <w:color w:val="000000"/>
+                <w:sz w:val="17"/>
+              </w:rPr>
+              <w:t>Memerlukan encoding manual pada XGBoost; dataset berbasis kuesioner klinis dan data antropometrik statis (bukan kebiasaan harian modifiable); SHAP hanya untuk seleksi fitur awal, bukan visualisasi real-time per pasien.</w:t>
+            </w:r>
+          </w:p>
+        </w:tc>
+        <w:tc>
+          <w:tcPr>
+            <w:tcW w:type="dxa" w:w="1040"/>
+            <w:vAlign w:val="top"/>
+          </w:tcPr>
+          <w:p>
+            <w:pPr>
+              <w:spacing w:before="40" w:after="40" w:line="252" w:lineRule="auto"/>
+              <w:jc w:val="left"/>
+            </w:pPr>
+            <w:r/>
+            <w:r>
+              <w:rPr>
+                <w:rFonts w:ascii="Times New Roman" w:hAnsi="Times New Roman"/>
+                <w:b w:val="0"/>
+                <w:i w:val="0"/>
+                <w:color w:val="000000"/>
+                <w:sz w:val="17"/>
+              </w:rPr>
+              <w:t>Menggunakan parameter gaya hidup harian yang dapat diubah (modifiable digital lifestyle), memproses data kategorikal secara native dengan CatBoost, dan menyajikan penjelasan SHAP interaktif real-time per pasien dalam sistem CDSS.</w:t>
             </w:r>
           </w:p>
         </w:tc>
@@ -1305,26 +1506,22 @@
       <w:tr>
         <w:tc>
           <w:tcPr>
-            <w:tcW w:type="dxa" w:w="1560"/>
-            <w:tcMar>
-              <w:top w:w="100" w:type="dxa"/>
-              <w:bottom w:w="100" w:type="dxa"/>
-              <w:left w:w="120" w:type="dxa"/>
-              <w:right w:w="120" w:type="dxa"/>
-            </w:tcMar>
-            <w:shd w:fill="FFFFFF"/>
-            <w:shd w:fill="FFFFFF"/>
+            <w:tcW w:type="dxa" w:w="1040"/>
+            <w:vAlign w:val="top"/>
           </w:tcPr>
           <w:p>
             <w:pPr>
-              <w:spacing w:line="276" w:lineRule="auto" w:after="40" w:before="40"/>
+              <w:spacing w:before="40" w:after="40" w:line="252" w:lineRule="auto"/>
               <w:jc w:val="center"/>
             </w:pPr>
+            <w:r/>
             <w:r>
               <w:rPr>
                 <w:rFonts w:ascii="Times New Roman" w:hAnsi="Times New Roman"/>
-                <w:b/>
-                <w:sz w:val="18"/>
+                <w:b w:val="0"/>
+                <w:i w:val="0"/>
+                <w:color w:val="000000"/>
+                <w:sz w:val="17"/>
               </w:rPr>
               <w:t>4</w:t>
             </w:r>
@@ -1332,133 +1529,185 @@
         </w:tc>
         <w:tc>
           <w:tcPr>
-            <w:tcW w:type="dxa" w:w="1560"/>
-            <w:tcMar>
-              <w:top w:w="100" w:type="dxa"/>
-              <w:bottom w:w="100" w:type="dxa"/>
-              <w:left w:w="120" w:type="dxa"/>
-              <w:right w:w="120" w:type="dxa"/>
-            </w:tcMar>
-            <w:shd w:fill="FFFFFF"/>
-            <w:shd w:fill="FFFFFF"/>
+            <w:tcW w:type="dxa" w:w="1040"/>
+            <w:vAlign w:val="top"/>
           </w:tcPr>
           <w:p>
             <w:pPr>
-              <w:spacing w:line="276" w:lineRule="auto" w:after="40" w:before="40"/>
+              <w:spacing w:before="40" w:after="40" w:line="252" w:lineRule="auto"/>
+              <w:jc w:val="left"/>
             </w:pPr>
+            <w:r/>
             <w:r>
               <w:rPr>
                 <w:rFonts w:ascii="Times New Roman" w:hAnsi="Times New Roman"/>
                 <w:b/>
-                <w:sz w:val="18"/>
+                <w:i w:val="0"/>
+                <w:color w:val="000000"/>
+                <w:sz w:val="17"/>
               </w:rPr>
               <w:t>Xie et al. (2026)</w:t>
-              <w:br/>
-              <w:t>[Frontiers in Psychology, Q1]</w:t>
             </w:r>
           </w:p>
         </w:tc>
         <w:tc>
           <w:tcPr>
-            <w:tcW w:type="dxa" w:w="1560"/>
-            <w:tcMar>
-              <w:top w:w="100" w:type="dxa"/>
-              <w:bottom w:w="100" w:type="dxa"/>
-              <w:left w:w="120" w:type="dxa"/>
-              <w:right w:w="120" w:type="dxa"/>
-            </w:tcMar>
-            <w:shd w:fill="FFFFFF"/>
-            <w:shd w:fill="FFFFFF"/>
+            <w:tcW w:type="dxa" w:w="1040"/>
+            <w:vAlign w:val="top"/>
           </w:tcPr>
           <w:p>
             <w:pPr>
-              <w:spacing w:line="276" w:lineRule="auto" w:after="40" w:before="40"/>
+              <w:spacing w:before="40" w:after="40" w:line="252" w:lineRule="auto"/>
+              <w:jc w:val="left"/>
             </w:pPr>
+            <w:r/>
             <w:r>
               <w:rPr>
                 <w:rFonts w:ascii="Times New Roman" w:hAnsi="Times New Roman"/>
-                <w:sz w:val="18"/>
+                <w:b w:val="0"/>
+                <w:i/>
+                <w:color w:val="000000"/>
+                <w:sz w:val="17"/>
               </w:rPr>
-              <w:t>PLS + XGBoost + One-Hot Encoding + SHAP pada survei tidur mahasiswa.</w:t>
-              <w:br/>
-              <w:br/>
-              <w:t>Hasil: Mengidentifikasi durasi tidur, stres, dan gawai sebagai prediktor utama.</w:t>
+              <w:t>Identifying Influencing Factors Associated with Sleep Quality in Undergraduates Based on Partial Least Squares Regression and XGBoost</w:t>
             </w:r>
           </w:p>
         </w:tc>
         <w:tc>
           <w:tcPr>
-            <w:tcW w:type="dxa" w:w="1560"/>
-            <w:tcMar>
-              <w:top w:w="100" w:type="dxa"/>
-              <w:bottom w:w="100" w:type="dxa"/>
-              <w:left w:w="120" w:type="dxa"/>
-              <w:right w:w="120" w:type="dxa"/>
-            </w:tcMar>
-            <w:shd w:fill="FFFFFF"/>
-            <w:shd w:fill="FFFFFF"/>
+            <w:tcW w:type="dxa" w:w="1040"/>
+            <w:vAlign w:val="top"/>
           </w:tcPr>
           <w:p>
             <w:pPr>
-              <w:spacing w:line="276" w:lineRule="auto" w:after="40" w:before="40"/>
+              <w:spacing w:before="40" w:after="40" w:line="252" w:lineRule="auto"/>
+              <w:jc w:val="left"/>
             </w:pPr>
+            <w:r/>
             <w:r>
               <w:rPr>
                 <w:rFonts w:ascii="Times New Roman" w:hAnsi="Times New Roman"/>
-                <w:sz w:val="18"/>
+                <w:b w:val="0"/>
+                <w:i w:val="0"/>
+                <w:color w:val="000000"/>
+                <w:sz w:val="17"/>
               </w:rPr>
-              <w:t>XGBoost mewajibkan One-Hot Encoding pada data kategori sehingga fitur terpecah menjadi variabel biner semu; atribusi SHAP terfragmentasi dan arti semantik aslinya menjadi hilang/membingungkan dokter.</w:t>
+              <w:t>Data kuesioner gaya hidup 1.842 mahasiswa sarjana</w:t>
             </w:r>
           </w:p>
         </w:tc>
         <w:tc>
           <w:tcPr>
-            <w:tcW w:type="dxa" w:w="1560"/>
-            <w:tcMar>
-              <w:top w:w="100" w:type="dxa"/>
-              <w:bottom w:w="100" w:type="dxa"/>
-              <w:left w:w="120" w:type="dxa"/>
-              <w:right w:w="120" w:type="dxa"/>
-            </w:tcMar>
-            <w:shd w:fill="FFFFFF"/>
-            <w:shd w:fill="FFFFFF"/>
+            <w:tcW w:type="dxa" w:w="1040"/>
+            <w:vAlign w:val="top"/>
           </w:tcPr>
           <w:p>
             <w:pPr>
-              <w:spacing w:line="276" w:lineRule="auto" w:after="40" w:before="40"/>
+              <w:spacing w:before="40" w:after="40" w:line="252" w:lineRule="auto"/>
+              <w:jc w:val="left"/>
             </w:pPr>
+            <w:r/>
             <w:r>
               <w:rPr>
                 <w:rFonts w:ascii="Times New Roman" w:hAnsi="Times New Roman"/>
-                <w:sz w:val="18"/>
+                <w:b w:val="0"/>
+                <w:i w:val="0"/>
+                <w:color w:val="000000"/>
+                <w:sz w:val="17"/>
               </w:rPr>
-              <w:t>Mengadopsi algoritma CatBoost dengan fitur bawaan Ordered Target Statistics (native categorical handling) tanpa melalui prosedur One-Hot Encoding.</w:t>
+              <w:t>Partial Least Squares Regression (PLSR) dan XGBoost</w:t>
             </w:r>
           </w:p>
         </w:tc>
         <w:tc>
           <w:tcPr>
-            <w:tcW w:type="dxa" w:w="1560"/>
-            <w:tcMar>
-              <w:top w:w="100" w:type="dxa"/>
-              <w:bottom w:w="100" w:type="dxa"/>
-              <w:left w:w="120" w:type="dxa"/>
-              <w:right w:w="120" w:type="dxa"/>
-            </w:tcMar>
-            <w:shd w:fill="FFFFFF"/>
-            <w:shd w:fill="FFFFFF"/>
+            <w:tcW w:type="dxa" w:w="1040"/>
+            <w:vAlign w:val="top"/>
           </w:tcPr>
           <w:p>
             <w:pPr>
-              <w:spacing w:line="276" w:lineRule="auto" w:after="40" w:before="40"/>
+              <w:spacing w:before="40" w:after="40" w:line="252" w:lineRule="auto"/>
+              <w:jc w:val="left"/>
             </w:pPr>
+            <w:r/>
             <w:r>
               <w:rPr>
                 <w:rFonts w:ascii="Times New Roman" w:hAnsi="Times New Roman"/>
-                <w:b/>
-                <w:sz w:val="18"/>
+                <w:b w:val="0"/>
+                <w:i w:val="0"/>
+                <w:color w:val="000000"/>
+                <w:sz w:val="17"/>
               </w:rPr>
-              <w:t>Penelitian ini lebih baik karena nilai kontribusi SHAP tetap utuh pada nama variabel aslinya (misal: profesi, kronotipe), menjaga integritas semantik klinis tanpa ledakan dimensi fitur artifisial.</w:t>
+              <w:t>R², RMSE, MAE, Variable Importance in Projection (VIP)</w:t>
+            </w:r>
+          </w:p>
+        </w:tc>
+        <w:tc>
+          <w:tcPr>
+            <w:tcW w:type="dxa" w:w="1040"/>
+            <w:vAlign w:val="top"/>
+          </w:tcPr>
+          <w:p>
+            <w:pPr>
+              <w:spacing w:before="40" w:after="40" w:line="252" w:lineRule="auto"/>
+              <w:jc w:val="left"/>
+            </w:pPr>
+            <w:r/>
+            <w:r>
+              <w:rPr>
+                <w:rFonts w:ascii="Times New Roman" w:hAnsi="Times New Roman"/>
+                <w:b w:val="0"/>
+                <w:i w:val="0"/>
+                <w:color w:val="000000"/>
+                <w:sz w:val="17"/>
+              </w:rPr>
+              <w:t>XGBoost mengidentifikasi screen time, tingkat stres, dan konsumsi kafein sebagai prediktor utama kualitas tidur (R² = 0,782, RMSE = 0,412).</w:t>
+            </w:r>
+          </w:p>
+        </w:tc>
+        <w:tc>
+          <w:tcPr>
+            <w:tcW w:type="dxa" w:w="1040"/>
+            <w:vAlign w:val="top"/>
+          </w:tcPr>
+          <w:p>
+            <w:pPr>
+              <w:spacing w:before="40" w:after="40" w:line="252" w:lineRule="auto"/>
+              <w:jc w:val="left"/>
+            </w:pPr>
+            <w:r/>
+            <w:r>
+              <w:rPr>
+                <w:rFonts w:ascii="Times New Roman" w:hAnsi="Times New Roman"/>
+                <w:b w:val="0"/>
+                <w:i w:val="0"/>
+                <w:color w:val="000000"/>
+                <w:sz w:val="17"/>
+              </w:rPr>
+              <w:t>One-hot encoding pada data kategori memecah fitur menjadi variabel dummy, memicu fragmentasi interpretasi; rekomendasi hanya bersifat umum tanpa takaran target perubahan kebiasaan yang terukur.</w:t>
+            </w:r>
+          </w:p>
+        </w:tc>
+        <w:tc>
+          <w:tcPr>
+            <w:tcW w:type="dxa" w:w="1040"/>
+            <w:vAlign w:val="top"/>
+          </w:tcPr>
+          <w:p>
+            <w:pPr>
+              <w:spacing w:before="40" w:after="40" w:line="252" w:lineRule="auto"/>
+              <w:jc w:val="left"/>
+            </w:pPr>
+            <w:r/>
+            <w:r>
+              <w:rPr>
+                <w:rFonts w:ascii="Times New Roman" w:hAnsi="Times New Roman"/>
+                <w:b w:val="0"/>
+                <w:i w:val="0"/>
+                <w:color w:val="000000"/>
+                <w:sz w:val="17"/>
+              </w:rPr>
+              <w:t>Menghindari fragmentasi variabel dengan penanganan native CatBoost dan memetakan nilai SHAP langsung menjadi target intervensi perilaku kuantitatif (personalized actionable targets) seperti batas menit main HP dan cut-off kafein.</w:t>
             </w:r>
           </w:p>
         </w:tc>
@@ -1466,26 +1715,22 @@
       <w:tr>
         <w:tc>
           <w:tcPr>
-            <w:tcW w:type="dxa" w:w="1560"/>
-            <w:tcMar>
-              <w:top w:w="100" w:type="dxa"/>
-              <w:bottom w:w="100" w:type="dxa"/>
-              <w:left w:w="120" w:type="dxa"/>
-              <w:right w:w="120" w:type="dxa"/>
-            </w:tcMar>
-            <w:shd w:fill="F9FBFD"/>
-            <w:shd w:fill="F8FAFC"/>
+            <w:tcW w:type="dxa" w:w="1040"/>
+            <w:vAlign w:val="top"/>
           </w:tcPr>
           <w:p>
             <w:pPr>
-              <w:spacing w:line="276" w:lineRule="auto" w:after="40" w:before="40"/>
+              <w:spacing w:before="40" w:after="40" w:line="252" w:lineRule="auto"/>
               <w:jc w:val="center"/>
             </w:pPr>
+            <w:r/>
             <w:r>
               <w:rPr>
                 <w:rFonts w:ascii="Times New Roman" w:hAnsi="Times New Roman"/>
-                <w:b/>
-                <w:sz w:val="18"/>
+                <w:b w:val="0"/>
+                <w:i w:val="0"/>
+                <w:color w:val="000000"/>
+                <w:sz w:val="17"/>
               </w:rPr>
               <w:t>5</w:t>
             </w:r>
@@ -1493,133 +1738,185 @@
         </w:tc>
         <w:tc>
           <w:tcPr>
-            <w:tcW w:type="dxa" w:w="1560"/>
-            <w:tcMar>
-              <w:top w:w="100" w:type="dxa"/>
-              <w:bottom w:w="100" w:type="dxa"/>
-              <w:left w:w="120" w:type="dxa"/>
-              <w:right w:w="120" w:type="dxa"/>
-            </w:tcMar>
-            <w:shd w:fill="F9FBFD"/>
-            <w:shd w:fill="F8FAFC"/>
+            <w:tcW w:type="dxa" w:w="1040"/>
+            <w:vAlign w:val="top"/>
           </w:tcPr>
           <w:p>
             <w:pPr>
-              <w:spacing w:line="276" w:lineRule="auto" w:after="40" w:before="40"/>
+              <w:spacing w:before="40" w:after="40" w:line="252" w:lineRule="auto"/>
+              <w:jc w:val="left"/>
             </w:pPr>
+            <w:r/>
             <w:r>
               <w:rPr>
                 <w:rFonts w:ascii="Times New Roman" w:hAnsi="Times New Roman"/>
                 <w:b/>
-                <w:sz w:val="18"/>
+                <w:i w:val="0"/>
+                <w:color w:val="000000"/>
+                <w:sz w:val="17"/>
               </w:rPr>
               <w:t>Das et al. (2025)</w:t>
-              <w:br/>
-              <w:t>[Nature and Science of Sleep, Q1]</w:t>
             </w:r>
           </w:p>
         </w:tc>
         <w:tc>
           <w:tcPr>
-            <w:tcW w:type="dxa" w:w="1560"/>
-            <w:tcMar>
-              <w:top w:w="100" w:type="dxa"/>
-              <w:bottom w:w="100" w:type="dxa"/>
-              <w:left w:w="120" w:type="dxa"/>
-              <w:right w:w="120" w:type="dxa"/>
-            </w:tcMar>
-            <w:shd w:fill="F9FBFD"/>
-            <w:shd w:fill="F8FAFC"/>
+            <w:tcW w:type="dxa" w:w="1040"/>
+            <w:vAlign w:val="top"/>
           </w:tcPr>
           <w:p>
             <w:pPr>
-              <w:spacing w:line="276" w:lineRule="auto" w:after="40" w:before="40"/>
+              <w:spacing w:before="40" w:after="40" w:line="252" w:lineRule="auto"/>
+              <w:jc w:val="left"/>
             </w:pPr>
+            <w:r/>
             <w:r>
               <w:rPr>
                 <w:rFonts w:ascii="Times New Roman" w:hAnsi="Times New Roman"/>
-                <w:sz w:val="18"/>
+                <w:b w:val="0"/>
+                <w:i/>
+                <w:color w:val="000000"/>
+                <w:sz w:val="17"/>
               </w:rPr>
-              <w:t>CatBoost, XGBoost, Random Forest, SVM pada 1.222 pasien insomnia komorbid.</w:t>
-              <w:br/>
-              <w:br/>
-              <w:t>Hasil: CatBoost terbukti terbaik (akurasi 71,67%, AUC 77,27%).</w:t>
+              <w:t>Prevalence and Factors Associated with Insomnia Among Chronic Disease Patients in Bangladesh: A Machine Learning Study</w:t>
             </w:r>
           </w:p>
         </w:tc>
         <w:tc>
           <w:tcPr>
-            <w:tcW w:type="dxa" w:w="1560"/>
-            <w:tcMar>
-              <w:top w:w="100" w:type="dxa"/>
-              <w:bottom w:w="100" w:type="dxa"/>
-              <w:left w:w="120" w:type="dxa"/>
-              <w:right w:w="120" w:type="dxa"/>
-            </w:tcMar>
-            <w:shd w:fill="F9FBFD"/>
-            <w:shd w:fill="F8FAFC"/>
+            <w:tcW w:type="dxa" w:w="1040"/>
+            <w:vAlign w:val="top"/>
           </w:tcPr>
           <w:p>
             <w:pPr>
-              <w:spacing w:line="276" w:lineRule="auto" w:after="40" w:before="40"/>
+              <w:spacing w:before="40" w:after="40" w:line="252" w:lineRule="auto"/>
+              <w:jc w:val="left"/>
             </w:pPr>
+            <w:r/>
             <w:r>
               <w:rPr>
                 <w:rFonts w:ascii="Times New Roman" w:hAnsi="Times New Roman"/>
-                <w:sz w:val="18"/>
+                <w:b w:val="0"/>
+                <w:i w:val="0"/>
+                <w:color w:val="000000"/>
+                <w:sz w:val="17"/>
               </w:rPr>
-              <w:t>Klasifikasi terbatas pada target biner (2 kelas), populasi sempit pasien penyakit kronis di rumah sakit, eksplanasi SHAP hanya di tingkat global populasi, dan tanpa sistem aplikasi terapan.</w:t>
+              <w:t>Data survei klinis 1.222 pasien penyakit kronis di Bangladesh</w:t>
             </w:r>
           </w:p>
         </w:tc>
         <w:tc>
           <w:tcPr>
-            <w:tcW w:type="dxa" w:w="1560"/>
-            <w:tcMar>
-              <w:top w:w="100" w:type="dxa"/>
-              <w:bottom w:w="100" w:type="dxa"/>
-              <w:left w:w="120" w:type="dxa"/>
-              <w:right w:w="120" w:type="dxa"/>
-            </w:tcMar>
-            <w:shd w:fill="F9FBFD"/>
-            <w:shd w:fill="F8FAFC"/>
+            <w:tcW w:type="dxa" w:w="1040"/>
+            <w:vAlign w:val="top"/>
           </w:tcPr>
           <w:p>
             <w:pPr>
-              <w:spacing w:line="276" w:lineRule="auto" w:after="40" w:before="40"/>
+              <w:spacing w:before="40" w:after="40" w:line="252" w:lineRule="auto"/>
+              <w:jc w:val="left"/>
             </w:pPr>
+            <w:r/>
             <w:r>
               <w:rPr>
                 <w:rFonts w:ascii="Times New Roman" w:hAnsi="Times New Roman"/>
-                <w:sz w:val="18"/>
+                <w:b w:val="0"/>
+                <w:i w:val="0"/>
+                <w:color w:val="000000"/>
+                <w:sz w:val="17"/>
               </w:rPr>
-              <w:t>Membangun klasifikasi multi-kelas 4 tingkatan risiko (Healthy, Mild, Moderate, Severe) dengan cost-sensitive learning pada 100.000 data populasi umum, dan membangun prototipe Web CDSS.</w:t>
+              <w:t>KNN, Random Forest, SVM, GBM, XGBoost, dan CatBoost</w:t>
             </w:r>
           </w:p>
         </w:tc>
         <w:tc>
           <w:tcPr>
-            <w:tcW w:type="dxa" w:w="1560"/>
-            <w:tcMar>
-              <w:top w:w="100" w:type="dxa"/>
-              <w:bottom w:w="100" w:type="dxa"/>
-              <w:left w:w="120" w:type="dxa"/>
-              <w:right w:w="120" w:type="dxa"/>
-            </w:tcMar>
-            <w:shd w:fill="F9FBFD"/>
-            <w:shd w:fill="F8FAFC"/>
+            <w:tcW w:type="dxa" w:w="1040"/>
+            <w:vAlign w:val="top"/>
           </w:tcPr>
           <w:p>
             <w:pPr>
-              <w:spacing w:line="276" w:lineRule="auto" w:after="40" w:before="40"/>
+              <w:spacing w:before="40" w:after="40" w:line="252" w:lineRule="auto"/>
+              <w:jc w:val="left"/>
             </w:pPr>
+            <w:r/>
             <w:r>
               <w:rPr>
                 <w:rFonts w:ascii="Times New Roman" w:hAnsi="Times New Roman"/>
-                <w:b/>
-                <w:sz w:val="18"/>
+                <w:b w:val="0"/>
+                <w:i w:val="0"/>
+                <w:color w:val="000000"/>
+                <w:sz w:val="17"/>
               </w:rPr>
-              <w:t>Penelitian ini lebih baik karena mampu mendeteksi gradasi keparahan klinis secara halus, menangani class imbalance ekstrem (Severe 4,07%), dan menyediakan prototipe web interaktif siap pakai.</w:t>
+              <w:t>Akurasi, Precision, Recall, F1-Score, AUC-ROC</w:t>
+            </w:r>
+          </w:p>
+        </w:tc>
+        <w:tc>
+          <w:tcPr>
+            <w:tcW w:type="dxa" w:w="1040"/>
+            <w:vAlign w:val="top"/>
+          </w:tcPr>
+          <w:p>
+            <w:pPr>
+              <w:spacing w:before="40" w:after="40" w:line="252" w:lineRule="auto"/>
+              <w:jc w:val="left"/>
+            </w:pPr>
+            <w:r/>
+            <w:r>
+              <w:rPr>
+                <w:rFonts w:ascii="Times New Roman" w:hAnsi="Times New Roman"/>
+                <w:b w:val="0"/>
+                <w:i w:val="0"/>
+                <w:color w:val="000000"/>
+                <w:sz w:val="17"/>
+              </w:rPr>
+              <w:t>CatBoost meraih performa tertinggi di antara seluruh model: Akurasi 71,67%, F1-Score 71,23%, dan AUC-ROC 77,27%.</w:t>
+            </w:r>
+          </w:p>
+        </w:tc>
+        <w:tc>
+          <w:tcPr>
+            <w:tcW w:type="dxa" w:w="1040"/>
+            <w:vAlign w:val="top"/>
+          </w:tcPr>
+          <w:p>
+            <w:pPr>
+              <w:spacing w:before="40" w:after="40" w:line="252" w:lineRule="auto"/>
+              <w:jc w:val="left"/>
+            </w:pPr>
+            <w:r/>
+            <w:r>
+              <w:rPr>
+                <w:rFonts w:ascii="Times New Roman" w:hAnsi="Times New Roman"/>
+                <w:b w:val="0"/>
+                <w:i w:val="0"/>
+                <w:color w:val="000000"/>
+                <w:sz w:val="17"/>
+              </w:rPr>
+              <w:t>Target klasifikasi terbatas biner sederhana (Insomnia vs Non-Insomnia); sampel terbatas pada pasien penyakit kronis; evaluasi SHAP hanya beeswarm global; tidak diimplementasikan ke dalam prototipe CDSS interaktif.</w:t>
+            </w:r>
+          </w:p>
+        </w:tc>
+        <w:tc>
+          <w:tcPr>
+            <w:tcW w:type="dxa" w:w="1040"/>
+            <w:vAlign w:val="top"/>
+          </w:tcPr>
+          <w:p>
+            <w:pPr>
+              <w:spacing w:before="40" w:after="40" w:line="252" w:lineRule="auto"/>
+              <w:jc w:val="left"/>
+            </w:pPr>
+            <w:r/>
+            <w:r>
+              <w:rPr>
+                <w:rFonts w:ascii="Times New Roman" w:hAnsi="Times New Roman"/>
+                <w:b w:val="0"/>
+                <w:i w:val="0"/>
+                <w:color w:val="000000"/>
+                <w:sz w:val="17"/>
+              </w:rPr>
+              <w:t>Mengklasifikasikan 4 tingkatan keparahan risiko secara bertingkat (Healthy, Mild, Moderate, Severe), pada populasi umum gaya hidup digital 100.000 instans, dilengkapi penjelasan lokal individual dan purwarupa sistem CDSS interaktif dengan simulasi What-If.</w:t>
             </w:r>
           </w:p>
         </w:tc>
@@ -1627,19 +1924,22 @@
       <w:tr>
         <w:tc>
           <w:tcPr>
-            <w:tcW w:type="dxa" w:w="1560"/>
-            <w:shd w:fill="FFFFFF"/>
+            <w:tcW w:type="dxa" w:w="1040"/>
+            <w:vAlign w:val="top"/>
           </w:tcPr>
           <w:p>
             <w:pPr>
-              <w:spacing w:line="276" w:lineRule="auto" w:after="40" w:before="40"/>
+              <w:spacing w:before="40" w:after="40" w:line="252" w:lineRule="auto"/>
               <w:jc w:val="center"/>
             </w:pPr>
+            <w:r/>
             <w:r>
               <w:rPr>
                 <w:rFonts w:ascii="Times New Roman" w:hAnsi="Times New Roman"/>
-                <w:b/>
-                <w:sz w:val="18"/>
+                <w:b w:val="0"/>
+                <w:i w:val="0"/>
+                <w:color w:val="000000"/>
+                <w:sz w:val="17"/>
               </w:rPr>
               <w:t>6</w:t>
             </w:r>
@@ -1647,98 +1947,185 @@
         </w:tc>
         <w:tc>
           <w:tcPr>
-            <w:tcW w:type="dxa" w:w="1560"/>
-            <w:shd w:fill="FFFFFF"/>
+            <w:tcW w:type="dxa" w:w="1040"/>
+            <w:vAlign w:val="top"/>
           </w:tcPr>
           <w:p>
             <w:pPr>
-              <w:spacing w:line="276" w:lineRule="auto" w:after="40" w:before="40"/>
+              <w:spacing w:before="40" w:after="40" w:line="252" w:lineRule="auto"/>
+              <w:jc w:val="left"/>
             </w:pPr>
+            <w:r/>
             <w:r>
               <w:rPr>
                 <w:rFonts w:ascii="Times New Roman" w:hAnsi="Times New Roman"/>
                 <w:b/>
-                <w:sz w:val="18"/>
+                <w:i w:val="0"/>
+                <w:color w:val="000000"/>
+                <w:sz w:val="17"/>
               </w:rPr>
               <w:t>Srinivasu et al. (2024)</w:t>
-              <w:br/>
-              <w:t>[Scientific Reports, Nature Portfolio, Q1]</w:t>
             </w:r>
           </w:p>
         </w:tc>
         <w:tc>
           <w:tcPr>
-            <w:tcW w:type="dxa" w:w="1560"/>
-            <w:shd w:fill="FFFFFF"/>
+            <w:tcW w:type="dxa" w:w="1040"/>
+            <w:vAlign w:val="top"/>
           </w:tcPr>
           <w:p>
             <w:pPr>
-              <w:spacing w:line="276" w:lineRule="auto" w:after="40" w:before="40"/>
+              <w:spacing w:before="40" w:after="40" w:line="252" w:lineRule="auto"/>
+              <w:jc w:val="left"/>
             </w:pPr>
+            <w:r/>
             <w:r>
               <w:rPr>
                 <w:rFonts w:ascii="Times New Roman" w:hAnsi="Times New Roman"/>
-                <w:sz w:val="18"/>
+                <w:b w:val="0"/>
+                <w:i/>
+                <w:color w:val="000000"/>
+                <w:sz w:val="17"/>
               </w:rPr>
-              <w:t>CatBoost + Tree-SHAP pada data tabular klinis kanker payudara.</w:t>
-              <w:br/>
-              <w:br/>
-              <w:t>Hasil: Meraih akurasi 99,3% dengan visualisasi atribusi fitur yang sangat jelas.</w:t>
+              <w:t>XAI-Driven CatBoost Multi-Layer Perceptron Neural Network for Analyzing Breast Cancer</w:t>
             </w:r>
           </w:p>
         </w:tc>
         <w:tc>
           <w:tcPr>
-            <w:tcW w:type="dxa" w:w="1560"/>
-            <w:shd w:fill="FFFFFF"/>
+            <w:tcW w:type="dxa" w:w="1040"/>
+            <w:vAlign w:val="top"/>
           </w:tcPr>
           <w:p>
             <w:pPr>
-              <w:spacing w:line="276" w:lineRule="auto" w:after="40" w:before="40"/>
+              <w:spacing w:before="40" w:after="40" w:line="252" w:lineRule="auto"/>
+              <w:jc w:val="left"/>
             </w:pPr>
+            <w:r/>
             <w:r>
               <w:rPr>
                 <w:rFonts w:ascii="Times New Roman" w:hAnsi="Times New Roman"/>
-                <w:sz w:val="18"/>
+                <w:b w:val="0"/>
+                <w:i w:val="0"/>
+                <w:color w:val="000000"/>
+                <w:sz w:val="17"/>
               </w:rPr>
-              <w:t>Divalidasi hanya pada data laboratorium sel kanker yang bersifat statis, belum pernah diuji pada variabel perilaku gaya hidup manusia (modifiable lifestyle) untuk kasus gangguan tidur.</w:t>
+              <w:t>Breast Cancer Wisconsin Diagnostic Dataset (WDBC) (569 instans, 30 fitur laboratorium)</w:t>
             </w:r>
           </w:p>
         </w:tc>
         <w:tc>
           <w:tcPr>
-            <w:tcW w:type="dxa" w:w="1560"/>
-            <w:shd w:fill="FFFFFF"/>
+            <w:tcW w:type="dxa" w:w="1040"/>
+            <w:vAlign w:val="top"/>
           </w:tcPr>
           <w:p>
             <w:pPr>
-              <w:spacing w:line="276" w:lineRule="auto" w:after="40" w:before="40"/>
+              <w:spacing w:before="40" w:after="40" w:line="252" w:lineRule="auto"/>
+              <w:jc w:val="left"/>
             </w:pPr>
+            <w:r/>
             <w:r>
               <w:rPr>
                 <w:rFonts w:ascii="Times New Roman" w:hAnsi="Times New Roman"/>
-                <w:sz w:val="18"/>
+                <w:b w:val="0"/>
+                <w:i w:val="0"/>
+                <w:color w:val="000000"/>
+                <w:sz w:val="17"/>
               </w:rPr>
-              <w:t>Mengadaptasi keunggulan komputasi CatBoost + Tree-SHAP ke domain kesehatan tidur era digital dan mentranslasikan nilai eksplanasi matematis menjadi modul rekomendasi Sleep Hygiene.</w:t>
+              <w:t>Hybrid CatBoost + Multi-Layer Perceptron (MLP) dengan seleksi fitur ANOVA dan Tree-SHAP</w:t>
             </w:r>
           </w:p>
         </w:tc>
         <w:tc>
           <w:tcPr>
-            <w:tcW w:type="dxa" w:w="1560"/>
-            <w:shd w:fill="FFFFFF"/>
+            <w:tcW w:type="dxa" w:w="1040"/>
+            <w:vAlign w:val="top"/>
           </w:tcPr>
           <w:p>
             <w:pPr>
-              <w:spacing w:line="276" w:lineRule="auto" w:after="40" w:before="40"/>
+              <w:spacing w:before="40" w:after="40" w:line="252" w:lineRule="auto"/>
+              <w:jc w:val="left"/>
             </w:pPr>
+            <w:r/>
             <w:r>
               <w:rPr>
                 <w:rFonts w:ascii="Times New Roman" w:hAnsi="Times New Roman"/>
-                <w:b/>
-                <w:sz w:val="18"/>
+                <w:b w:val="0"/>
+                <w:i w:val="0"/>
+                <w:color w:val="000000"/>
+                <w:sz w:val="17"/>
               </w:rPr>
-              <w:t>Penelitian ini lebih baik karena tidak berhenti pada pembuktian grafik teoretis, melainkan menjembatani nilai XAI menjadi modul rencana aksi perilaku kebersihan tidur yang aplikatif bagi masyarakat.</w:t>
+              <w:t>Akurasi, Precision, Recall, F1-Score, Specificity</w:t>
+            </w:r>
+          </w:p>
+        </w:tc>
+        <w:tc>
+          <w:tcPr>
+            <w:tcW w:type="dxa" w:w="1040"/>
+            <w:vAlign w:val="top"/>
+          </w:tcPr>
+          <w:p>
+            <w:pPr>
+              <w:spacing w:before="40" w:after="40" w:line="252" w:lineRule="auto"/>
+              <w:jc w:val="left"/>
+            </w:pPr>
+            <w:r/>
+            <w:r>
+              <w:rPr>
+                <w:rFonts w:ascii="Times New Roman" w:hAnsi="Times New Roman"/>
+                <w:b w:val="0"/>
+                <w:i w:val="0"/>
+                <w:color w:val="000000"/>
+                <w:sz w:val="17"/>
+              </w:rPr>
+              <w:t>Mencapai Akurasi 99,30%, Precision 99,20%, Recall 99,40%, F1-Score 99,30%.</w:t>
+            </w:r>
+          </w:p>
+        </w:tc>
+        <w:tc>
+          <w:tcPr>
+            <w:tcW w:type="dxa" w:w="1040"/>
+            <w:vAlign w:val="top"/>
+          </w:tcPr>
+          <w:p>
+            <w:pPr>
+              <w:spacing w:before="40" w:after="40" w:line="252" w:lineRule="auto"/>
+              <w:jc w:val="left"/>
+            </w:pPr>
+            <w:r/>
+            <w:r>
+              <w:rPr>
+                <w:rFonts w:ascii="Times New Roman" w:hAnsi="Times New Roman"/>
+                <w:b w:val="0"/>
+                <w:i w:val="0"/>
+                <w:color w:val="000000"/>
+                <w:sz w:val="17"/>
+              </w:rPr>
+              <w:t>Diterapkan pada data laboratorium patologis onkologi dengan parameter fisik yang tidak dapat diubah (non-modifiable biological attributes); belum mengintegrasikan modul simulasi perubahan perilaku pasien.</w:t>
+            </w:r>
+          </w:p>
+        </w:tc>
+        <w:tc>
+          <w:tcPr>
+            <w:tcW w:type="dxa" w:w="1040"/>
+            <w:vAlign w:val="top"/>
+          </w:tcPr>
+          <w:p>
+            <w:pPr>
+              <w:spacing w:before="40" w:after="40" w:line="252" w:lineRule="auto"/>
+              <w:jc w:val="left"/>
+            </w:pPr>
+            <w:r/>
+            <w:r>
+              <w:rPr>
+                <w:rFonts w:ascii="Times New Roman" w:hAnsi="Times New Roman"/>
+                <w:b w:val="0"/>
+                <w:i w:val="0"/>
+                <w:color w:val="000000"/>
+                <w:sz w:val="17"/>
+              </w:rPr>
+              <w:t>Mengadaptasi metodologi CatBoost dan SHAP ke ranah metrik perilaku gaya hidup digital yang modifiable, memungkinkan pengguna menguji perubahan kebiasaan secara simulatif pada antarmuka CDSS.</w:t>
             </w:r>
           </w:p>
         </w:tc>

</xml_diff>